<commit_message>
Fold Data Sources section into a brief intro on the Data Pipeline section
Removes the standalone "Data Sources" section (5 subsections + summary
table) and replaces it with a short paragraph naming the four sources
at the top of what is now "2. Data Pipeline & Dataset Construction".
Renumbers every subsequent section and in-text section reference.
</commit_message>
<xml_diff>
--- a/docs/report/Final_Report.docx
+++ b/docs/report/Final_Report.docx
@@ -140,7 +140,7 @@
           <w:color w:val="606060"/>
           <w:sz w:val="20"/>
         </w:rPr>
-        <w:t>This report supersedes the project proposal (docs/project_proposal.pdf) with the system as actually built and evaluated: the data pipeline, the eight frozen XGBoost severity classifiers, and the experimental results gathered to date. The Active Feature Acquisition reinforcement-learning agent described in the proposal is a designed but not-yet-implemented extension; its status is stated explicitly in Section 6.</w:t>
+        <w:t>This report supersedes the project proposal (docs/project_proposal.pdf) with the system as actually built and evaluated: the data pipeline, the eight frozen XGBoost severity classifiers, and the experimental results gathered to date. The Active Feature Acquisition reinforcement-learning agent described in the proposal is a designed but not-yet-implemented extension; its status is stated explicitly in Section 5.</w:t>
       </w:r>
     </w:p>
     <w:p>
@@ -250,7 +250,7 @@
           <w:i w:val="0"/>
           <w:sz w:val="22"/>
         </w:rPr>
-        <w:t>The problem is cast as supervised classification over the STATS19 collision_severity label (Fatal / Serious / Slight, and a binary Slight-vs-Severe collapse). Rather than relying on STATS19 alone, every accident record is enriched with three external, non-trivially-joined data sources — OpenStreetMap road infrastructure, DfT AADF traffic volume, and Open-Meteo historical weather — each of which may or may not be available, or worth the latency, at dispatch time. Eight classifiers are trained, one per subset of the three external sources, so that whichever combination of sources happens to be available at inference time, a matching model exists. The long-term goal (Section 6) is a reinforcement-learning agent that decides at runtime which of the three sources are worth acquiring before invoking the matching classifier; that agent is not yet built, and the classifiers described in this report are the environment it will eventually sit on top of.</w:t>
+        <w:t>The problem is cast as supervised classification over the STATS19 collision_severity label (Fatal / Serious / Slight, and a binary Slight-vs-Severe collapse). Rather than relying on STATS19 alone, every accident record is enriched with three external, non-trivially-joined data sources — OpenStreetMap road infrastructure, DfT AADF traffic volume, and Open-Meteo historical weather — each of which may or may not be available, or worth the latency, at dispatch time. Eight classifiers are trained, one per subset of the three external sources, so that whichever combination of sources happens to be available at inference time, a matching model exists. The long-term goal (Section 5) is a reinforcement-learning agent that decides at runtime which of the three sources are worth acquiring before invoking the matching classifier; that agent is not yet built, and the classifiers described in this report are the environment it will eventually sit on top of.</w:t>
       </w:r>
     </w:p>
     <w:p>
@@ -268,20 +268,7 @@
           <w:color w:val="14548C"/>
           <w:sz w:val="40"/>
         </w:rPr>
-        <w:t>2. Data Sources</w:t>
-      </w:r>
-    </w:p>
-    <w:p>
-      <w:pPr>
-        <w:pStyle w:val="Heading2"/>
-      </w:pPr>
-      <w:r>
-        <w:rPr>
-          <w:b/>
-          <w:color w:val="14548C"/>
-          <w:sz w:val="30"/>
-        </w:rPr>
-        <w:t>2.1 STATS19 — UK Official Accident Database</w:t>
+        <w:t>2. Data Pipeline &amp; Dataset Construction</w:t>
       </w:r>
     </w:p>
     <w:p>
@@ -294,495 +281,7 @@
           <w:i w:val="0"/>
           <w:sz w:val="22"/>
         </w:rPr>
-        <w:t>STATS19 is Britain's official road-traffic casualty database, recording every personal-injury accident reported to the police since 1979. It is downloaded via the ropensci/stats19 R package and provides three tables joinable on collision_index:</w:t>
-      </w:r>
-    </w:p>
-    <w:p>
-      <w:pPr>
-        <w:pStyle w:val="ListBullet"/>
-        <w:spacing w:after="80"/>
-      </w:pPr>
-      <w:r>
-        <w:rPr>
-          <w:b/>
-          <w:sz w:val="22"/>
-        </w:rPr>
-        <w:t xml:space="preserve">Accidents </w:t>
-      </w:r>
-      <w:r>
-        <w:rPr>
-          <w:sz w:val="22"/>
-        </w:rPr>
-        <w:t>— location (lat/lon), date/time, road type, weather, light conditions, speed limit, junction type, severity.</w:t>
-      </w:r>
-    </w:p>
-    <w:p>
-      <w:pPr>
-        <w:pStyle w:val="ListBullet"/>
-        <w:spacing w:after="80"/>
-      </w:pPr>
-      <w:r>
-        <w:rPr>
-          <w:b/>
-          <w:sz w:val="22"/>
-        </w:rPr>
-        <w:t xml:space="preserve">Casualties </w:t>
-      </w:r>
-      <w:r>
-        <w:rPr>
-          <w:sz w:val="22"/>
-        </w:rPr>
-        <w:t>— age, sex, casualty class, injury severity per person.</w:t>
-      </w:r>
-    </w:p>
-    <w:p>
-      <w:pPr>
-        <w:pStyle w:val="ListBullet"/>
-        <w:spacing w:after="80"/>
-      </w:pPr>
-      <w:r>
-        <w:rPr>
-          <w:b/>
-          <w:sz w:val="22"/>
-        </w:rPr>
-        <w:t xml:space="preserve">Vehicles </w:t>
-      </w:r>
-      <w:r>
-        <w:rPr>
-          <w:sz w:val="22"/>
-        </w:rPr>
-        <w:t>— vehicle type, manoeuvre, driver age, engine capacity.</w:t>
-      </w:r>
-    </w:p>
-    <w:p>
-      <w:pPr>
-        <w:pStyle w:val="Heading2"/>
-      </w:pPr>
-      <w:r>
-        <w:rPr>
-          <w:b/>
-          <w:color w:val="14548C"/>
-          <w:sz w:val="30"/>
-        </w:rPr>
-        <w:t>2.2 DfT AADF — Traffic Volume</w:t>
-      </w:r>
-    </w:p>
-    <w:p>
-      <w:pPr>
-        <w:spacing w:after="160"/>
-      </w:pPr>
-      <w:r>
-        <w:rPr>
-          <w:b w:val="0"/>
-          <w:i w:val="0"/>
-          <w:sz w:val="22"/>
-        </w:rPr>
-        <w:t>The Department for Transport's Annual Average Daily Flow (AADF) dataset gives the estimated number of vehicles passing each count point on the major road network per day, for 2000–2024. Each accident is matched to the nearest AADF count point on the same named road (falling back to the nearest count point on any road if no same-road point exists), producing a road-busyness feature absent from STATS19 itself.</w:t>
-      </w:r>
-    </w:p>
-    <w:p>
-      <w:pPr>
-        <w:pStyle w:val="Heading2"/>
-      </w:pPr>
-      <w:r>
-        <w:rPr>
-          <w:b/>
-          <w:color w:val="14548C"/>
-          <w:sz w:val="30"/>
-        </w:rPr>
-        <w:t>2.3 OpenStreetMap — Road Infrastructure</w:t>
-      </w:r>
-    </w:p>
-    <w:p>
-      <w:pPr>
-        <w:spacing w:after="160"/>
-      </w:pPr>
-      <w:r>
-        <w:rPr>
-          <w:b w:val="0"/>
-          <w:i w:val="0"/>
-          <w:sz w:val="22"/>
-        </w:rPr>
-        <w:t>Road-level infrastructure features are pulled from OpenStreetMap: a Great Britain PBF extract (via the osmextract R package) for national-scale road ways and barriers, and the Overpass API for sparse point features (speed cameras, traffic calming, traffic signals). Because the OSM snapshot reflects the network as it exists today rather than as it was at each accident's date, these features are a present-day proxy, not a historically exact record.</w:t>
-      </w:r>
-    </w:p>
-    <w:p>
-      <w:pPr>
-        <w:pStyle w:val="Heading2"/>
-      </w:pPr>
-      <w:r>
-        <w:rPr>
-          <w:b/>
-          <w:color w:val="14548C"/>
-          <w:sz w:val="30"/>
-        </w:rPr>
-        <w:t>2.4 Open-Meteo — Historical Weather</w:t>
-      </w:r>
-    </w:p>
-    <w:p>
-      <w:pPr>
-        <w:spacing w:after="160"/>
-      </w:pPr>
-      <w:r>
-        <w:rPr>
-          <w:b w:val="0"/>
-          <w:i w:val="0"/>
-          <w:sz w:val="22"/>
-        </w:rPr>
-        <w:t>STATS19's weather_conditions field is a subjective category assessed after the fact by the attending officer. Open-Meteo's Historical Weather API (ERA5/ERA5-Land reanalysis) supplies objective, continuous hourly measurements — temperature, precipitation, wind speed, snowfall, snow depth, and a WMO weather code — at the exact latitude/longitude and hour of each accident, batched by date to keep call volume manageable.</w:t>
-      </w:r>
-    </w:p>
-    <w:p>
-      <w:pPr>
-        <w:pStyle w:val="Heading2"/>
-      </w:pPr>
-      <w:r>
-        <w:rPr>
-          <w:b/>
-          <w:color w:val="14548C"/>
-          <w:sz w:val="30"/>
-        </w:rPr>
-        <w:t>2.5 Data Sources Summary</w:t>
-      </w:r>
-    </w:p>
-    <w:tbl>
-      <w:tblPr>
-        <w:tblStyle w:val="TableGrid"/>
-        <w:tblW w:type="auto" w:w="0"/>
-        <w:jc w:val="center"/>
-        <w:tblLayout w:type="autofit"/>
-        <w:tblLook w:firstColumn="1" w:firstRow="1" w:lastColumn="0" w:lastRow="0" w:noHBand="0" w:noVBand="1" w:val="04A0"/>
-      </w:tblPr>
-      <w:tblGrid>
-        <w:gridCol w:w="2436"/>
-        <w:gridCol w:w="2436"/>
-        <w:gridCol w:w="2436"/>
-        <w:gridCol w:w="2436"/>
-      </w:tblGrid>
-      <w:tr>
-        <w:tc>
-          <w:tcPr>
-            <w:tcW w:type="dxa" w:w="2268"/>
-            <w:shd w:val="clear" w:color="auto" w:fill="14548C"/>
-          </w:tcPr>
-          <w:p>
-            <w:r/>
-            <w:r>
-              <w:rPr>
-                <w:b/>
-                <w:color w:val="FFFFFF"/>
-                <w:sz w:val="20"/>
-              </w:rPr>
-              <w:t>Source</w:t>
-            </w:r>
-          </w:p>
-        </w:tc>
-        <w:tc>
-          <w:tcPr>
-            <w:tcW w:type="dxa" w:w="2268"/>
-            <w:shd w:val="clear" w:color="auto" w:fill="14548C"/>
-          </w:tcPr>
-          <w:p>
-            <w:r/>
-            <w:r>
-              <w:rPr>
-                <w:b/>
-                <w:color w:val="FFFFFF"/>
-                <w:sz w:val="20"/>
-              </w:rPr>
-              <w:t>Role</w:t>
-            </w:r>
-          </w:p>
-        </w:tc>
-        <w:tc>
-          <w:tcPr>
-            <w:tcW w:type="dxa" w:w="2835"/>
-            <w:shd w:val="clear" w:color="auto" w:fill="14548C"/>
-          </w:tcPr>
-          <w:p>
-            <w:r/>
-            <w:r>
-              <w:rPr>
-                <w:b/>
-                <w:color w:val="FFFFFF"/>
-                <w:sz w:val="20"/>
-              </w:rPr>
-              <w:t>Join method</w:t>
-            </w:r>
-          </w:p>
-        </w:tc>
-        <w:tc>
-          <w:tcPr>
-            <w:tcW w:type="dxa" w:w="1984"/>
-            <w:shd w:val="clear" w:color="auto" w:fill="14548C"/>
-          </w:tcPr>
-          <w:p>
-            <w:r/>
-            <w:r>
-              <w:rPr>
-                <w:b/>
-                <w:color w:val="FFFFFF"/>
-                <w:sz w:val="20"/>
-              </w:rPr>
-              <w:t>Cost</w:t>
-            </w:r>
-          </w:p>
-        </w:tc>
-      </w:tr>
-      <w:tr>
-        <w:tc>
-          <w:tcPr>
-            <w:tcW w:type="dxa" w:w="2268"/>
-          </w:tcPr>
-          <w:p>
-            <w:r/>
-            <w:r>
-              <w:rPr>
-                <w:sz w:val="20"/>
-              </w:rPr>
-              <w:t>STATS19 (DfT)</w:t>
-            </w:r>
-          </w:p>
-        </w:tc>
-        <w:tc>
-          <w:tcPr>
-            <w:tcW w:type="dxa" w:w="2268"/>
-          </w:tcPr>
-          <w:p>
-            <w:r/>
-            <w:r>
-              <w:rPr>
-                <w:sz w:val="20"/>
-              </w:rPr>
-              <w:t>Primary dataset + labels</w:t>
-            </w:r>
-          </w:p>
-        </w:tc>
-        <w:tc>
-          <w:tcPr>
-            <w:tcW w:type="dxa" w:w="2835"/>
-          </w:tcPr>
-          <w:p>
-            <w:r/>
-            <w:r>
-              <w:rPr>
-                <w:sz w:val="20"/>
-              </w:rPr>
-              <w:t>Primary (no join)</w:t>
-            </w:r>
-          </w:p>
-        </w:tc>
-        <w:tc>
-          <w:tcPr>
-            <w:tcW w:type="dxa" w:w="1984"/>
-          </w:tcPr>
-          <w:p>
-            <w:r/>
-            <w:r>
-              <w:rPr>
-                <w:sz w:val="20"/>
-              </w:rPr>
-              <w:t>Free</w:t>
-            </w:r>
-          </w:p>
-        </w:tc>
-      </w:tr>
-      <w:tr>
-        <w:tc>
-          <w:tcPr>
-            <w:tcW w:type="dxa" w:w="2268"/>
-          </w:tcPr>
-          <w:p>
-            <w:r/>
-            <w:r>
-              <w:rPr>
-                <w:sz w:val="20"/>
-              </w:rPr>
-              <w:t>DfT AADF Traffic</w:t>
-            </w:r>
-          </w:p>
-        </w:tc>
-        <w:tc>
-          <w:tcPr>
-            <w:tcW w:type="dxa" w:w="2268"/>
-          </w:tcPr>
-          <w:p>
-            <w:r/>
-            <w:r>
-              <w:rPr>
-                <w:sz w:val="20"/>
-              </w:rPr>
-              <w:t>Traffic volume feature</w:t>
-            </w:r>
-          </w:p>
-        </w:tc>
-        <w:tc>
-          <w:tcPr>
-            <w:tcW w:type="dxa" w:w="2835"/>
-          </w:tcPr>
-          <w:p>
-            <w:r/>
-            <w:r>
-              <w:rPr>
-                <w:sz w:val="20"/>
-              </w:rPr>
-              <w:t>Spatial (nearest count point)</w:t>
-            </w:r>
-          </w:p>
-        </w:tc>
-        <w:tc>
-          <w:tcPr>
-            <w:tcW w:type="dxa" w:w="1984"/>
-          </w:tcPr>
-          <w:p>
-            <w:r/>
-            <w:r>
-              <w:rPr>
-                <w:sz w:val="20"/>
-              </w:rPr>
-              <w:t>Free</w:t>
-            </w:r>
-          </w:p>
-        </w:tc>
-      </w:tr>
-      <w:tr>
-        <w:tc>
-          <w:tcPr>
-            <w:tcW w:type="dxa" w:w="2268"/>
-          </w:tcPr>
-          <w:p>
-            <w:r/>
-            <w:r>
-              <w:rPr>
-                <w:sz w:val="20"/>
-              </w:rPr>
-              <w:t>OpenStreetMap</w:t>
-            </w:r>
-          </w:p>
-        </w:tc>
-        <w:tc>
-          <w:tcPr>
-            <w:tcW w:type="dxa" w:w="2268"/>
-          </w:tcPr>
-          <w:p>
-            <w:r/>
-            <w:r>
-              <w:rPr>
-                <w:sz w:val="20"/>
-              </w:rPr>
-              <w:t>Road infrastructure features</w:t>
-            </w:r>
-          </w:p>
-        </w:tc>
-        <w:tc>
-          <w:tcPr>
-            <w:tcW w:type="dxa" w:w="2835"/>
-          </w:tcPr>
-          <w:p>
-            <w:r/>
-            <w:r>
-              <w:rPr>
-                <w:sz w:val="20"/>
-              </w:rPr>
-              <w:t>Spatial (lat/lon radius)</w:t>
-            </w:r>
-          </w:p>
-        </w:tc>
-        <w:tc>
-          <w:tcPr>
-            <w:tcW w:type="dxa" w:w="1984"/>
-          </w:tcPr>
-          <w:p>
-            <w:r/>
-            <w:r>
-              <w:rPr>
-                <w:sz w:val="20"/>
-              </w:rPr>
-              <w:t>Free</w:t>
-            </w:r>
-          </w:p>
-        </w:tc>
-      </w:tr>
-      <w:tr>
-        <w:tc>
-          <w:tcPr>
-            <w:tcW w:type="dxa" w:w="2268"/>
-          </w:tcPr>
-          <w:p>
-            <w:r/>
-            <w:r>
-              <w:rPr>
-                <w:sz w:val="20"/>
-              </w:rPr>
-              <w:t>Open-Meteo Historical</w:t>
-            </w:r>
-          </w:p>
-        </w:tc>
-        <w:tc>
-          <w:tcPr>
-            <w:tcW w:type="dxa" w:w="2268"/>
-          </w:tcPr>
-          <w:p>
-            <w:r/>
-            <w:r>
-              <w:rPr>
-                <w:sz w:val="20"/>
-              </w:rPr>
-              <w:t>Hourly weather at exact location</w:t>
-            </w:r>
-          </w:p>
-        </w:tc>
-        <w:tc>
-          <w:tcPr>
-            <w:tcW w:type="dxa" w:w="2835"/>
-          </w:tcPr>
-          <w:p>
-            <w:r/>
-            <w:r>
-              <w:rPr>
-                <w:sz w:val="20"/>
-              </w:rPr>
-              <w:t>API call by lat/lon + datetime</w:t>
-            </w:r>
-          </w:p>
-        </w:tc>
-        <w:tc>
-          <w:tcPr>
-            <w:tcW w:type="dxa" w:w="1984"/>
-          </w:tcPr>
-          <w:p>
-            <w:r/>
-            <w:r>
-              <w:rPr>
-                <w:sz w:val="20"/>
-              </w:rPr>
-              <w:t>Paid (Professional plan, €99)</w:t>
-            </w:r>
-          </w:p>
-        </w:tc>
-      </w:tr>
-    </w:tbl>
-    <w:p>
-      <w:pPr>
-        <w:spacing w:after="80"/>
-      </w:pPr>
-    </w:p>
-    <w:p>
-      <w:r>
-        <w:br w:type="page"/>
-      </w:r>
-    </w:p>
-    <w:p>
-      <w:pPr>
-        <w:pStyle w:val="Heading1"/>
-      </w:pPr>
-      <w:r>
-        <w:rPr>
-          <w:b/>
-          <w:color w:val="14548C"/>
-          <w:sz w:val="40"/>
-        </w:rPr>
-        <w:t>3. Data Pipeline &amp; Dataset Construction</w:t>
+        <w:t>The predictive features are drawn from four sources: STATS19, the UK Department for Transport's official road-accident database, which supplies the primary records and the severity label; DfT AADF, annual traffic-volume counts joined to each accident by nearest count point; OpenStreetMap, road-infrastructure detail (speed cameras, lane count, medians) pulled via the Overpass API and Geofabrik extracts; and Open-Meteo, objective historical weather at the accident's exact location and hour, replacing STATS19's subjective officer-recorded weather field. STATS19, AADF, and OpenStreetMap are free; Open-Meteo requires a paid Professional plan (€99) for reliable historical-data volume. The pipeline below folds all four into a single feature table stage by stage.</w:t>
       </w:r>
     </w:p>
     <w:p>
@@ -808,7 +307,7 @@
           <w:color w:val="14548C"/>
           <w:sz w:val="30"/>
         </w:rPr>
-        <w:t>3.1 Severity-Aware Sampling</w:t>
+        <w:t>2.1 Severity-Aware Sampling</w:t>
       </w:r>
     </w:p>
     <w:p>
@@ -834,7 +333,7 @@
           <w:color w:val="14548C"/>
           <w:sz w:val="30"/>
         </w:rPr>
-        <w:t>3.2 Dataset-Difficulty History</w:t>
+        <w:t>2.2 Dataset-Difficulty History</w:t>
       </w:r>
     </w:p>
     <w:p>
@@ -1184,7 +683,7 @@
           <w:i w:val="0"/>
           <w:sz w:val="22"/>
         </w:rPr>
-        <w:t>Config 2 was a deliberate attempt to build a near-population-realistic benchmark (4.6× more data, Fatal-of-Severe close to the true ~7%): it produced a harder, more representative dataset on which macro F1 fell despite additional tuning and new features. A cap-sweep across seven configurations confirmed that score tracks Fatal-of-Severe share monotonically rather than dataset size — larger datasets scored worse here because every added row was a hard Serious case. Config 3, the currently active dataset, was then built by subsampling the archived config-2 data down to half the original caps, explicitly to buy a macro F1 above 0.70. This is a legitimate but material choice: Fatal is ≈53% of Severe in the active dataset against ≈7% in the real population, so every macro-F1 figure in this report should be read as a score on that benchmark, not an estimate of field performance (Section 7.6 discusses the population-realistic reconstruction). All three configs' data are preserved on disk / in git history for reproducibility.</w:t>
+        <w:t>Config 2 was a deliberate attempt to build a near-population-realistic benchmark (4.6× more data, Fatal-of-Severe close to the true ~7%): it produced a harder, more representative dataset on which macro F1 fell despite additional tuning and new features. A cap-sweep across seven configurations confirmed that score tracks Fatal-of-Severe share monotonically rather than dataset size — larger datasets scored worse here because every added row was a hard Serious case. Config 3, the currently active dataset, was then built by subsampling the archived config-2 data down to half the original caps, explicitly to buy a macro F1 above 0.70. This is a legitimate but material choice: Fatal is ≈53% of Severe in the active dataset against ≈7% in the real population, so every macro-F1 figure in this report should be read as a score on that benchmark, not an estimate of field performance (Section 6.6 discusses the population-realistic reconstruction). All three configs' data are preserved on disk / in git history for reproducibility.</w:t>
       </w:r>
     </w:p>
     <w:p>
@@ -1197,7 +696,7 @@
           <w:color w:val="14548C"/>
           <w:sz w:val="30"/>
         </w:rPr>
-        <w:t>3.3 Feature Engineering</w:t>
+        <w:t>2.3 Feature Engineering</w:t>
       </w:r>
     </w:p>
     <w:p>
@@ -1582,7 +1081,7 @@
               <w:rPr>
                 <w:sz w:val="20"/>
               </w:rPr>
-              <w:t>Single largest accuracy gain in the project (Section 7.3)</w:t>
+              <w:t>Single largest accuracy gain in the project (Section 6.3)</w:t>
             </w:r>
           </w:p>
         </w:tc>
@@ -1603,7 +1102,7 @@
           <w:color w:val="14548C"/>
           <w:sz w:val="30"/>
         </w:rPr>
-        <w:t>3.4 Data Variants</w:t>
+        <w:t>2.4 Data Variants</w:t>
       </w:r>
     </w:p>
     <w:p>
@@ -1691,7 +1190,7 @@
           <w:color w:val="14548C"/>
           <w:sz w:val="40"/>
         </w:rPr>
-        <w:t>4. Model Architecture &amp; Training</w:t>
+        <w:t>3. Model Architecture &amp; Training</w:t>
       </w:r>
     </w:p>
     <w:p>
@@ -1704,7 +1203,7 @@
           <w:color w:val="14548C"/>
           <w:sz w:val="30"/>
         </w:rPr>
-        <w:t>4.1 Eight Source-Subset Classifiers</w:t>
+        <w:t>3.1 Eight Source-Subset Classifiers</w:t>
       </w:r>
     </w:p>
     <w:p>
@@ -1717,7 +1216,7 @@
           <w:i w:val="0"/>
           <w:sz w:val="22"/>
         </w:rPr>
-        <w:t>Because any of the three external sources may or may not be acquired before a prediction is needed, eight classifiers are trained — one per subset of {AADF, OSM, meteo}, from base-only (no external sources) up to full acquisition (all three). Each is an XGBoost classifier using native categorical and missing-value handling, trained via CODE/training/train/train_classifier.py, which defines the feature set through BASE_COLS (always present) plus SOURCE_COLS[source] (added when that source is acquired). The models are frozen once trained — they form the environment that the planned RL agent (Section 6) will later query.</w:t>
+        <w:t>Because any of the three external sources may or may not be acquired before a prediction is needed, eight classifiers are trained — one per subset of {AADF, OSM, meteo}, from base-only (no external sources) up to full acquisition (all three). Each is an XGBoost classifier using native categorical and missing-value handling, trained via CODE/training/train/train_classifier.py, which defines the feature set through BASE_COLS (always present) plus SOURCE_COLS[source] (added when that source is acquired). The models are frozen once trained — they form the environment that the planned RL agent (Section 5) will later query.</w:t>
       </w:r>
     </w:p>
     <w:p>
@@ -1730,7 +1229,7 @@
           <w:color w:val="14548C"/>
           <w:sz w:val="30"/>
         </w:rPr>
-        <w:t>4.2 Target Variable</w:t>
+        <w:t>3.2 Target Variable</w:t>
       </w:r>
     </w:p>
     <w:p>
@@ -1756,7 +1255,7 @@
           <w:color w:val="14548C"/>
           <w:sz w:val="30"/>
         </w:rPr>
-        <w:t>4.3 Hyperparameter Tuning</w:t>
+        <w:t>3.3 Hyperparameter Tuning</w:t>
       </w:r>
     </w:p>
     <w:p>
@@ -1782,7 +1281,7 @@
           <w:color w:val="14548C"/>
           <w:sz w:val="30"/>
         </w:rPr>
-        <w:t>4.4 Threshold Calibration</w:t>
+        <w:t>3.4 Threshold Calibration</w:t>
       </w:r>
     </w:p>
     <w:p>
@@ -1813,7 +1312,7 @@
           <w:color w:val="14548C"/>
           <w:sz w:val="40"/>
         </w:rPr>
-        <w:t>5. Choice of Model Family</w:t>
+        <w:t>4. Choice of Model Family</w:t>
       </w:r>
     </w:p>
     <w:p>
@@ -2662,7 +2161,7 @@
           <w:color w:val="14548C"/>
           <w:sz w:val="40"/>
         </w:rPr>
-        <w:t>6. Active Feature Acquisition (Planned Extension)</w:t>
+        <w:t>5. Active Feature Acquisition (Planned Extension)</w:t>
       </w:r>
     </w:p>
     <w:p>
@@ -2675,7 +2174,7 @@
           <w:i w:val="0"/>
           <w:sz w:val="22"/>
         </w:rPr>
-        <w:t>The eventual goal of the project is a reinforcement-learning agent that decides, at runtime and per accident, which of the three external sources are worth acquiring before invoking the matching frozen classifier from Section 4 — trading prediction confidence against acquisition latency and API cost. This component has been fully designed but is not yet implemented; the eight classifiers described above are the environment it will be trained against. The design is summarised here so the planned system is documented alongside the parts that already exist.</w:t>
+        <w:t>The eventual goal of the project is a reinforcement-learning agent that decides, at runtime and per accident, which of the three external sources are worth acquiring before invoking the matching frozen classifier from Section 3 — trading prediction confidence against acquisition latency and API cost. This component has been fully designed but is not yet implemented; the eight classifiers described above are the environment it will be trained against. The design is summarised here so the planned system is documented alongside the parts that already exist.</w:t>
       </w:r>
     </w:p>
     <w:p>
@@ -2688,7 +2187,7 @@
           <w:color w:val="14548C"/>
           <w:sz w:val="30"/>
         </w:rPr>
-        <w:t>6.1 MDP Formulation</w:t>
+        <w:t>5.1 MDP Formulation</w:t>
       </w:r>
     </w:p>
     <w:p>
@@ -2740,7 +2239,7 @@
           <w:color w:val="14548C"/>
           <w:sz w:val="30"/>
         </w:rPr>
-        <w:t>6.2 Planned Baselines</w:t>
+        <w:t>5.2 Planned Baselines</w:t>
       </w:r>
     </w:p>
     <w:p>
@@ -2778,7 +2277,7 @@
         <w:rPr>
           <w:sz w:val="22"/>
         </w:rPr>
-        <w:t>— always acquires all three sources; maximum cost, upper-bound accuracy (see Section 7.5 for the closely related full-STATS19 ceiling).</w:t>
+        <w:t>— always acquires all three sources; maximum cost, upper-bound accuracy (see Section 6.5 for the closely related full-STATS19 ceiling).</w:t>
       </w:r>
     </w:p>
     <w:p>
@@ -2810,7 +2309,7 @@
           <w:i w:val="0"/>
           <w:sz w:val="22"/>
         </w:rPr>
-        <w:t>The per-source ablation results in Section 7 are the intended basis for calibrating each source's acquisition cost Cᵢ in the reward function: a source with a large accuracy gain relative to its cost should be cheap to acquire; a source that contributes little should be expensive enough that the agent learns to skip it.</w:t>
+        <w:t>The per-source ablation results in Section 6 are the intended basis for calibrating each source's acquisition cost Cᵢ in the reward function: a source with a large accuracy gain relative to its cost should be cheap to acquire; a source that contributes little should be expensive enough that the agent learns to skip it.</w:t>
       </w:r>
     </w:p>
     <w:p>
@@ -2828,7 +2327,7 @@
           <w:color w:val="14548C"/>
           <w:sz w:val="40"/>
         </w:rPr>
-        <w:t>7. Experiments &amp; Results</w:t>
+        <w:t>6. Experiments &amp; Results</w:t>
       </w:r>
     </w:p>
     <w:p>
@@ -2841,7 +2340,7 @@
           <w:color w:val="14548C"/>
           <w:sz w:val="30"/>
         </w:rPr>
-        <w:t>7.1 Headline Result</w:t>
+        <w:t>6.1 Headline Result</w:t>
       </w:r>
     </w:p>
     <w:p>
@@ -2854,7 +2353,7 @@
           <w:i w:val="0"/>
           <w:sz w:val="22"/>
         </w:rPr>
-        <w:t>The current project focus, the full-acquisition (aadf+osm+meteo) binary Slight-vs-Severe classifier on the normalized data variant, reaches test macro F1 = 0.7322 in its single-run training log and 0.7367 ± 0.001 averaged over three seeds in the model-family comparison (Section 5) — both measured on the current, 1,400/2,800-cap dataset (Section 3.2). All macro-F1 figures in this report are tied to a specific dataset configuration; comparing across configurations without noting which one is in play is misleading, since the score is driven substantially by how Fatal-heavy the Severe class is (Section 3.2).</w:t>
+        <w:t>The current project focus, the full-acquisition (aadf+osm+meteo) binary Slight-vs-Severe classifier on the normalized data variant, reaches test macro F1 = 0.7322 in its single-run training log and 0.7367 ± 0.001 averaged over three seeds in the model-family comparison (Section 4) — both measured on the current, 1,400/2,800-cap dataset (Section 2.2). All macro-F1 figures in this report are tied to a specific dataset configuration; comparing across configurations without noting which one is in play is misleading, since the score is driven substantially by how Fatal-heavy the Severe class is (Section 2.2).</w:t>
       </w:r>
     </w:p>
     <w:p>
@@ -2867,7 +2366,7 @@
           <w:color w:val="14548C"/>
           <w:sz w:val="30"/>
         </w:rPr>
-        <w:t>7.2 Dispatch-Time Ceiling: Full-STATS19 Upper Bound</w:t>
+        <w:t>6.2 Dispatch-Time Ceiling: Full-STATS19 Upper Bound</w:t>
       </w:r>
     </w:p>
     <w:p>
@@ -2969,7 +2468,7 @@
           <w:color w:val="14548C"/>
           <w:sz w:val="30"/>
         </w:rPr>
-        <w:t>7.3 Dispatch-Time Casualty Features</w:t>
+        <w:t>6.3 Dispatch-Time Casualty Features</w:t>
       </w:r>
     </w:p>
     <w:p>
@@ -2995,7 +2494,7 @@
           <w:color w:val="14548C"/>
           <w:sz w:val="30"/>
         </w:rPr>
-        <w:t>7.4 Spatial Risk-Density Features</w:t>
+        <w:t>6.4 Spatial Risk-Density Features</w:t>
       </w:r>
     </w:p>
     <w:p>
@@ -3021,7 +2520,7 @@
           <w:color w:val="14548C"/>
           <w:sz w:val="30"/>
         </w:rPr>
-        <w:t>7.5 Vehicle-Type Flags</w:t>
+        <w:t>6.5 Vehicle-Type Flags</w:t>
       </w:r>
     </w:p>
     <w:p>
@@ -3047,7 +2546,7 @@
           <w:color w:val="14548C"/>
           <w:sz w:val="30"/>
         </w:rPr>
-        <w:t>7.6 Population-Realistic Evaluation</w:t>
+        <w:t>6.6 Population-Realistic Evaluation</w:t>
       </w:r>
     </w:p>
     <w:p>
@@ -3078,7 +2577,7 @@
           <w:color w:val="14548C"/>
           <w:sz w:val="40"/>
         </w:rPr>
-        <w:t>8. Discussion &amp; Limitations</w:t>
+        <w:t>7. Discussion &amp; Limitations</w:t>
       </w:r>
     </w:p>
     <w:p>
@@ -3097,7 +2596,7 @@
         <w:rPr>
           <w:sz w:val="22"/>
         </w:rPr>
-        <w:t>Every headline metric in this report is measured on a Fatal-enriched benchmark chosen to make the classification problem tractable and comparable across experiments; it is not an estimate of real-world dispatch accuracy. Section 7.6 gives the reconstruction path back to a population-realistic estimate.</w:t>
+        <w:t>Every headline metric in this report is measured on a Fatal-enriched benchmark chosen to make the classification problem tractable and comparable across experiments; it is not an estimate of real-world dispatch accuracy. Section 6.6 gives the reconstruction path back to a population-realistic estimate.</w:t>
       </w:r>
     </w:p>
     <w:p>
@@ -3154,7 +2653,7 @@
         <w:rPr>
           <w:sz w:val="22"/>
         </w:rPr>
-        <w:t>Section 5 shows the gap between the deployed XGBoost model and a plain thresholded linear regression is only 0.020 macro F1 — most of this project's measurable contribution is in the feature engineering, not the learning algorithm.</w:t>
+        <w:t>Section 4 shows the gap between the deployed XGBoost model and a plain thresholded linear regression is only 0.020 macro F1 — most of this project's measurable contribution is in the feature engineering, not the learning algorithm.</w:t>
       </w:r>
     </w:p>
     <w:p>
@@ -3173,7 +2672,7 @@
         <w:rPr>
           <w:sz w:val="22"/>
         </w:rPr>
-        <w:t>Section 6 documents its design; implementing, training, and evaluating it against the three baselines remains the primary open item in the project plan.</w:t>
+        <w:t>Section 5 documents its design; implementing, training, and evaluating it against the three baselines remains the primary open item in the project plan.</w:t>
       </w:r>
     </w:p>
     <w:p>
@@ -3191,7 +2690,7 @@
           <w:color w:val="14548C"/>
           <w:sz w:val="40"/>
         </w:rPr>
-        <w:t>9. Conclusion &amp; Future Work</w:t>
+        <w:t>8. Conclusion &amp; Future Work</w:t>
       </w:r>
     </w:p>
     <w:p>
@@ -3217,7 +2716,7 @@
           <w:i w:val="0"/>
           <w:sz w:val="22"/>
         </w:rPr>
-        <w:t>The immediate next steps are: (1) implement and train the Active Feature Acquisition reinforcement-learning agent designed in Section 6 against the frozen classifiers as its environment, calibrating per-source acquisition costs from the ablation results in Section 7; (2) evaluate the trained agent against the no-acquisition, full-acquisition, and static-priority baselines; and (3) extend the population-realistic reconstruction (Section 7.6) into a standard reporting step alongside every future macro-F1 result, so headline numbers and field-deployment expectations are never conflated.</w:t>
+        <w:t>The immediate next steps are: (1) implement and train the Active Feature Acquisition reinforcement-learning agent designed in Section 5 against the frozen classifiers as its environment, calibrating per-source acquisition costs from the ablation results in Section 6; (2) evaluate the trained agent against the no-acquisition, full-acquisition, and static-priority baselines; and (3) extend the population-realistic reconstruction (Section 6.6) into a standard reporting step alongside every future macro-F1 result, so headline numbers and field-deployment expectations are never conflated.</w:t>
       </w:r>
     </w:p>
     <w:p>
@@ -3495,7 +2994,7 @@
           <w:i w:val="0"/>
           <w:sz w:val="22"/>
         </w:rPr>
-        <w:t>There is no automated test suite, linter, or CI configuration in this repository; correctness is validated experimentally, via the ablations and comparisons summarised in Section 7.</w:t>
+        <w:t>There is no automated test suite, linter, or CI configuration in this repository; correctness is validated experimentally, via the ablations and comparisons summarised in Section 6.</w:t>
       </w:r>
     </w:p>
     <w:p>

</xml_diff>

<commit_message>
Add normalization row to the feature-engineering pipeline table
Cyclic encoding, log1p, and z-score were previously described only in
prose under Data Variants; the pipeline table now lists it as its own
stage alongside the other joins.
</commit_message>
<xml_diff>
--- a/docs/report/Final_Report.docx
+++ b/docs/report/Final_Report.docx
@@ -1082,6 +1082,50 @@
                 <w:sz w:val="20"/>
               </w:rPr>
               <w:t>Single largest accuracy gain in the project (Section 6.3)</w:t>
+            </w:r>
+          </w:p>
+        </w:tc>
+      </w:tr>
+      <w:tr>
+        <w:tc>
+          <w:tcPr>
+            <w:tcW w:type="dxa" w:w="2041"/>
+          </w:tcPr>
+          <w:p>
+            <w:r/>
+            <w:r>
+              <w:rPr>
+                <w:sz w:val="20"/>
+              </w:rPr>
+              <w:t>Normalization</w:t>
+            </w:r>
+          </w:p>
+        </w:tc>
+        <w:tc>
+          <w:tcPr>
+            <w:tcW w:type="dxa" w:w="3402"/>
+          </w:tcPr>
+          <w:p>
+            <w:r/>
+            <w:r>
+              <w:rPr>
+                <w:sz w:val="20"/>
+              </w:rPr>
+              <w:t>day_of_week_sin/cos, hour_sin/cos (cyclic); log1p + z-score on 17 skewed/continuous columns</w:t>
+            </w:r>
+          </w:p>
+        </w:tc>
+        <w:tc>
+          <w:tcPr>
+            <w:tcW w:type="dxa" w:w="3118"/>
+          </w:tcPr>
+          <w:p>
+            <w:r/>
+            <w:r>
+              <w:rPr>
+                <w:sz w:val="20"/>
+              </w:rPr>
+              <w:t>Train-only statistics applied to valid/test; nominal codes left as raw integer codes for native XGBoost categorical splits</w:t>
             </w:r>
           </w:p>
         </w:tc>

</xml_diff>